<commit_message>
docs(integration): Word y Postman de entrega ZOOM con links online Circa.
Incluye Swagger, ReDoc, OpenAPI, landing y base test como hipervínculos para el equipo externo.

Co-authored-by: Cursor <cursoragent@cursor.com>
</commit_message>
<xml_diff>
--- a/docs/integration/entrega_zoom_test/Circa_ZOOM_API_Socios_SOLO_TEST.docx
+++ b/docs/integration/entrega_zoom_test/Circa_ZOOM_API_Socios_SOLO_TEST.docx
@@ -15,7 +15,7 @@
         <w:rPr>
           <w:b w:val="0"/>
         </w:rPr>
-        <w:t>Versión 1.0 · 7 septiembre 2026</w:t>
+        <w:t>Versión 1.1 · 7 septiembre 2026</w:t>
       </w:r>
     </w:p>
     <w:p>
@@ -23,7 +23,7 @@
         <w:rPr>
           <w:b w:val="0"/>
         </w:rPr>
-        <w:t>IMPORTANTE: Este documento y la colección Postman adjunta son SOLO para ambiente de TEST. No usar producción.</w:t>
+        <w:t>IMPORTANTE: Solo ambiente de TEST. No usar producción hasta aviso de Circa.</w:t>
       </w:r>
     </w:p>
     <w:p>
@@ -31,7 +31,149 @@
         <w:pStyle w:val="Heading1"/>
       </w:pPr>
       <w:r>
-        <w:t>1. URLs de prueba</w:t>
+        <w:t>1. Dónde consultar la documentación online (Circa)</w:t>
+      </w:r>
+    </w:p>
+    <w:p>
+      <w:r>
+        <w:rPr>
+          <w:b/>
+        </w:rPr>
+        <w:t>Fuentes oficiales en el ambiente Circa (abrir en el navegador):</w:t>
+      </w:r>
+    </w:p>
+    <w:p>
+      <w:pPr>
+        <w:pStyle w:val="ListBullet"/>
+      </w:pPr>
+      <w:r>
+        <w:t xml:space="preserve">Swagger UI (probar APIs + credenciales en la descripción): </w:t>
+      </w:r>
+      <w:hyperlink r:id="rId9">
+        <w:r>
+          <w:rPr>
+            <w:color w:val="0563C1"/>
+            <w:u w:val="single"/>
+          </w:rPr>
+          <w:t>https://circa-production-c517.up.railway.app/api/v1/docs</w:t>
+        </w:r>
+      </w:hyperlink>
+    </w:p>
+    <w:p>
+      <w:pPr>
+        <w:pStyle w:val="ListBullet"/>
+      </w:pPr>
+      <w:r>
+        <w:t xml:space="preserve">ReDoc (lectura amigable del contrato): </w:t>
+      </w:r>
+      <w:hyperlink r:id="rId10">
+        <w:r>
+          <w:rPr>
+            <w:color w:val="0563C1"/>
+            <w:u w:val="single"/>
+          </w:rPr>
+          <w:t>https://circa-production-c517.up.railway.app/api/v1/redoc</w:t>
+        </w:r>
+      </w:hyperlink>
+    </w:p>
+    <w:p>
+      <w:pPr>
+        <w:pStyle w:val="ListBullet"/>
+      </w:pPr>
+      <w:r>
+        <w:t xml:space="preserve">OpenAPI JSON (importar en herramientas): </w:t>
+      </w:r>
+      <w:hyperlink r:id="rId11">
+        <w:r>
+          <w:rPr>
+            <w:color w:val="0563C1"/>
+            <w:u w:val="single"/>
+          </w:rPr>
+          <w:t>https://circa-production-c517.up.railway.app/api/v1/openapi.json</w:t>
+        </w:r>
+      </w:hyperlink>
+    </w:p>
+    <w:p>
+      <w:pPr>
+        <w:pStyle w:val="ListBullet"/>
+      </w:pPr>
+      <w:r>
+        <w:t xml:space="preserve">Landing API Socios: </w:t>
+      </w:r>
+      <w:hyperlink r:id="rId12">
+        <w:r>
+          <w:rPr>
+            <w:color w:val="0563C1"/>
+            <w:u w:val="single"/>
+          </w:rPr>
+          <w:t>https://circa-production-c517.up.railway.app/static/integration.html</w:t>
+        </w:r>
+      </w:hyperlink>
+    </w:p>
+    <w:p>
+      <w:pPr>
+        <w:pStyle w:val="ListBullet"/>
+      </w:pPr>
+      <w:r>
+        <w:t xml:space="preserve">Health modo test: </w:t>
+      </w:r>
+      <w:hyperlink r:id="rId13">
+        <w:r>
+          <w:rPr>
+            <w:color w:val="0563C1"/>
+            <w:u w:val="single"/>
+          </w:rPr>
+          <w:t>https://circa-production-c517.up.railway.app/api/v1/test/health</w:t>
+        </w:r>
+      </w:hyperlink>
+    </w:p>
+    <w:p>
+      <w:pPr>
+        <w:pStyle w:val="ListBullet"/>
+      </w:pPr>
+      <w:r>
+        <w:t xml:space="preserve">Base API test: </w:t>
+      </w:r>
+      <w:hyperlink r:id="rId14">
+        <w:r>
+          <w:rPr>
+            <w:color w:val="0563C1"/>
+            <w:u w:val="single"/>
+          </w:rPr>
+          <w:t>https://circa-production-c517.up.railway.app/api/v1/test</w:t>
+        </w:r>
+      </w:hyperlink>
+    </w:p>
+    <w:p>
+      <w:pPr>
+        <w:pStyle w:val="ListBullet"/>
+      </w:pPr>
+      <w:r>
+        <w:t xml:space="preserve">Endpoint Auth (token): </w:t>
+      </w:r>
+      <w:hyperlink r:id="rId15">
+        <w:r>
+          <w:rPr>
+            <w:color w:val="0563C1"/>
+            <w:u w:val="single"/>
+          </w:rPr>
+          <w:t>https://circa-production-c517.up.railway.app/api/v1/auth/token</w:t>
+        </w:r>
+      </w:hyperlink>
+    </w:p>
+    <w:p>
+      <w:r>
+        <w:rPr>
+          <w:b w:val="0"/>
+        </w:rPr>
+      </w:r>
+    </w:p>
+    <w:p>
+      <w:r>
+        <w:rPr>
+          <w:b/>
+        </w:rPr>
+        <w:t>Resumen de enlaces:</w:t>
       </w:r>
     </w:p>
     <w:tbl>
@@ -73,6 +215,94 @@
           </w:tcPr>
           <w:p>
             <w:r>
+              <w:t>Swagger UI</w:t>
+            </w:r>
+          </w:p>
+        </w:tc>
+        <w:tc>
+          <w:tcPr>
+            <w:tcW w:type="dxa" w:w="4320"/>
+          </w:tcPr>
+          <w:p>
+            <w:r>
+              <w:t>https://circa-production-c517.up.railway.app/api/v1/docs</w:t>
+            </w:r>
+          </w:p>
+        </w:tc>
+      </w:tr>
+      <w:tr>
+        <w:tc>
+          <w:tcPr>
+            <w:tcW w:type="dxa" w:w="4320"/>
+          </w:tcPr>
+          <w:p>
+            <w:r>
+              <w:t>ReDoc</w:t>
+            </w:r>
+          </w:p>
+        </w:tc>
+        <w:tc>
+          <w:tcPr>
+            <w:tcW w:type="dxa" w:w="4320"/>
+          </w:tcPr>
+          <w:p>
+            <w:r>
+              <w:t>https://circa-production-c517.up.railway.app/api/v1/redoc</w:t>
+            </w:r>
+          </w:p>
+        </w:tc>
+      </w:tr>
+      <w:tr>
+        <w:tc>
+          <w:tcPr>
+            <w:tcW w:type="dxa" w:w="4320"/>
+          </w:tcPr>
+          <w:p>
+            <w:r>
+              <w:t>OpenAPI JSON</w:t>
+            </w:r>
+          </w:p>
+        </w:tc>
+        <w:tc>
+          <w:tcPr>
+            <w:tcW w:type="dxa" w:w="4320"/>
+          </w:tcPr>
+          <w:p>
+            <w:r>
+              <w:t>https://circa-production-c517.up.railway.app/api/v1/openapi.json</w:t>
+            </w:r>
+          </w:p>
+        </w:tc>
+      </w:tr>
+      <w:tr>
+        <w:tc>
+          <w:tcPr>
+            <w:tcW w:type="dxa" w:w="4320"/>
+          </w:tcPr>
+          <w:p>
+            <w:r>
+              <w:t>Landing</w:t>
+            </w:r>
+          </w:p>
+        </w:tc>
+        <w:tc>
+          <w:tcPr>
+            <w:tcW w:type="dxa" w:w="4320"/>
+          </w:tcPr>
+          <w:p>
+            <w:r>
+              <w:t>https://circa-production-c517.up.railway.app/static/integration.html</w:t>
+            </w:r>
+          </w:p>
+        </w:tc>
+      </w:tr>
+      <w:tr>
+        <w:tc>
+          <w:tcPr>
+            <w:tcW w:type="dxa" w:w="4320"/>
+          </w:tcPr>
+          <w:p>
+            <w:r>
               <w:t>Base API test</w:t>
             </w:r>
           </w:p>
@@ -95,7 +325,7 @@
           </w:tcPr>
           <w:p>
             <w:r>
-              <w:t>Auth (token)</w:t>
+              <w:t>Auth token</w:t>
             </w:r>
           </w:p>
         </w:tc>
@@ -106,28 +336,6 @@
           <w:p>
             <w:r>
               <w:t>https://circa-production-c517.up.railway.app/api/v1/auth/token</w:t>
-            </w:r>
-          </w:p>
-        </w:tc>
-      </w:tr>
-      <w:tr>
-        <w:tc>
-          <w:tcPr>
-            <w:tcW w:type="dxa" w:w="4320"/>
-          </w:tcPr>
-          <w:p>
-            <w:r>
-              <w:t>Swagger</w:t>
-            </w:r>
-          </w:p>
-        </w:tc>
-        <w:tc>
-          <w:tcPr>
-            <w:tcW w:type="dxa" w:w="4320"/>
-          </w:tcPr>
-          <w:p>
-            <w:r>
-              <w:t>https://circa-production-c517.up.railway.app/api/v1/docs</w:t>
             </w:r>
           </w:p>
         </w:tc>
@@ -161,7 +369,7 @@
         <w:rPr>
           <w:b w:val="0"/>
         </w:rPr>
-        <w:t>Todas las operaciones de negocio van bajo /api/v1/test. No llamar /api/v1/ sin /test.</w:t>
+        <w:t>En Swagger: botón Authorize → pegar el Bearer de prueba → usar endpoints con tag « · test ».</w:t>
       </w:r>
     </w:p>
     <w:p>
@@ -385,7 +593,7 @@
         <w:pStyle w:val="ListBullet"/>
       </w:pPr>
       <w:r>
-        <w:t>expires_in = null → el token no caduca solo. Cachearlo; renovar ante HTTP 401.</w:t>
+        <w:t>expires_in = null → no caduca solo. Cachear; renovar ante HTTP 401.</w:t>
       </w:r>
     </w:p>
     <w:p>
@@ -393,7 +601,7 @@
         <w:pStyle w:val="ListBullet"/>
       </w:pPr>
       <w:r>
-        <w:t>Usar en cada servicio: Authorization: Bearer &lt;access_token&gt;</w:t>
+        <w:t>Header en cada servicio: Authorization: Bearer &lt;access_token&gt;</w:t>
       </w:r>
     </w:p>
     <w:p>
@@ -409,7 +617,7 @@
         <w:pStyle w:val="Heading1"/>
       </w:pPr>
       <w:r>
-        <w:t>4. Flujo entre Auth, SVC-01, SVC-02 y SVC-04</w:t>
+        <w:t>4. Flujo Auth → SVC-01 → SVC-02 → SVC-04</w:t>
       </w:r>
     </w:p>
     <w:p>
@@ -421,7 +629,7 @@
         <w:br/>
         <w:t xml:space="preserve">  → SVC-01 (consultar) → mirar situacion</w:t>
         <w:br/>
-        <w:t xml:space="preserve">       ├─ no_registrada  → SVC-02 (precargar + fotos) → guardar id → luego reconsultar</w:t>
+        <w:t xml:space="preserve">       ├─ no_registrada  → SVC-02 (precargar + fotos) → guardar id → reconsultar</w:t>
         <w:br/>
         <w:t xml:space="preserve">       ├─ en_evaluacion  → reconsultar SVC-01b (NO SVC-02 ni SVC-04)</w:t>
         <w:br/>
@@ -616,7 +824,7 @@
         <w:rPr>
           <w:b w:val="0"/>
         </w:rPr>
-        <w:t>Decidir siempre con items[i].situacion de la bodega del pedido (no solo la raíz del listado).</w:t>
+        <w:t>Usar items[i].situacion de la bodega del pedido.</w:t>
       </w:r>
     </w:p>
     <w:p>
@@ -648,7 +856,7 @@
         <w:rPr>
           <w:b w:val="0"/>
         </w:rPr>
-        <w:t>El parámetro q busca en: DNI, RUC, teléfono, razón social, nombre comercial.</w:t>
+        <w:t>q busca en: DNI, RUC, teléfono, razón social, nombre comercial.</w:t>
       </w:r>
     </w:p>
     <w:p>
@@ -830,7 +1038,7 @@
         <w:rPr>
           <w:b w:val="0"/>
         </w:rPr>
-        <w:t>Response vacía (ejemplo):</w:t>
+        <w:t>Ejemplo vacío: { "total": 0, "items": [], "situacion": "no_registrada" }</w:t>
       </w:r>
     </w:p>
     <w:p>
@@ -838,15 +1046,7 @@
         <w:rPr>
           <w:b w:val="0"/>
         </w:rPr>
-        <w:t>{ "total": 0, "items": [], "situacion": "no_registrada" }</w:t>
-      </w:r>
-    </w:p>
-    <w:p>
-      <w:r>
-        <w:rPr>
-          <w:b w:val="0"/>
-        </w:rPr>
-        <w:t>Si ya tienen UUID Circa: GET .../bodegas/{id} (SVC-01b).</w:t>
+        <w:t>Refresco por UUID (SVC-01b): GET https://circa-production-c517.up.railway.app/api/v1/test/bodegas/{id}</w:t>
       </w:r>
     </w:p>
     <w:p>
@@ -1121,7 +1321,7 @@
         <w:rPr>
           <w:b w:val="0"/>
         </w:rPr>
-        <w:t>Respuesta típica: id (guardar), situacion=en_evaluacion, linea_disponible=0, tiene_foto_*=true, es_test=true.</w:t>
+        <w:t>Respuesta: id (guardar), situacion=en_evaluacion, linea_disponible=0, es_test=true.</w:t>
       </w:r>
     </w:p>
     <w:p>
@@ -1129,7 +1329,7 @@
         <w:rPr>
           <w:b w:val="0"/>
         </w:rPr>
-        <w:t>Tras SVC-02 NO llamar SVC-04 todavía. Reconsultar hasta con_linea.</w:t>
+        <w:t>Tras SVC-02 no llamar SVC-04 hasta con_linea.</w:t>
       </w:r>
     </w:p>
     <w:p>
@@ -1404,14 +1604,8 @@
         <w:rPr>
           <w:b w:val="0"/>
         </w:rPr>
-        <w:t>Ejemplo JSON:</w:t>
-      </w:r>
-    </w:p>
-    <w:p>
-      <w:r>
-        <w:rPr>
-          <w:b w:val="0"/>
-        </w:rPr>
+        <w:t>Ejemplo:</w:t>
+        <w:br/>
         <w:t>{</w:t>
         <w:br/>
         <w:t xml:space="preserve">  "external_id": "PV-TEST-001",</w:t>
@@ -1438,7 +1632,7 @@
         <w:rPr>
           <w:b w:val="0"/>
         </w:rPr>
-        <w:t>Guardar el id de respuesta como circa_pedido_id. Opcional: GET /preventas/{id} (SVC-05) para polling.</w:t>
+        <w:t>Polling opcional (SVC-05): GET https://circa-production-c517.up.railway.app/api/v1/test/preventas/{id}</w:t>
       </w:r>
     </w:p>
     <w:p>
@@ -1488,7 +1682,7 @@
           </w:tcPr>
           <w:p>
             <w:r>
-              <w:t>Ruta</w:t>
+              <w:t>Ruta (bajo Base test)</w:t>
             </w:r>
           </w:p>
         </w:tc>
@@ -1926,14 +2120,6 @@
     </w:tbl>
     <w:p/>
     <w:p>
-      <w:r>
-        <w:rPr>
-          <w:b w:val="0"/>
-        </w:rPr>
-        <w:t>Las rutas de negocio se anteponen con la Base API test.</w:t>
-      </w:r>
-    </w:p>
-    <w:p>
       <w:pPr>
         <w:pStyle w:val="Heading1"/>
       </w:pPr>
@@ -1946,7 +2132,7 @@
         <w:pStyle w:val="ListBullet"/>
       </w:pPr>
       <w:r>
-        <w:t>Este Word: Circa_ZOOM_API_Socios_SOLO_TEST.docx</w:t>
+        <w:t>Word: Circa_ZOOM_API_Socios_SOLO_TEST.docx (este archivo)</w:t>
       </w:r>
     </w:p>
     <w:p>
@@ -1962,7 +2148,7 @@
         <w:pStyle w:val="ListBullet"/>
       </w:pPr>
       <w:r>
-        <w:t>Carpeta local del repo: docs/integration/entrega_zoom_test/</w:t>
+        <w:t>Carpeta local: docs/integration/entrega_zoom_test/</w:t>
       </w:r>
     </w:p>
     <w:p>
@@ -1970,7 +2156,7 @@
         <w:rPr>
           <w:b w:val="0"/>
         </w:rPr>
-        <w:t>Importar el JSON en Postman (Import → File). Variables ya traen client_id, client_secret y access_token.</w:t>
+        <w:t>Importar el JSON en Postman → Import → File. Variables ya traen client_id, secret y token.</w:t>
       </w:r>
     </w:p>
     <w:p>
@@ -1994,7 +2180,7 @@
         <w:rPr>
           <w:b w:val="0"/>
         </w:rPr>
-        <w:t>Cuando Circa habilite producción, se entregarán credenciales nuevas por canal seguro.</w:t>
+        <w:t>Producción se habilitará con credenciales nuevas por canal seguro.</w:t>
       </w:r>
     </w:p>
     <w:sectPr>

</xml_diff>